<commit_message>
Spell out Law and Entrepreneurship Association in CV
Co-Authored-By: Claude Opus 5 (1M context) <noreply@anthropic.com>
</commit_message>
<xml_diff>
--- a/Yifat Aran CV 2026 September 25.docx
+++ b/Yifat Aran CV 2026 September 25.docx
@@ -3810,7 +3810,7 @@
           <w:rFonts w:ascii="Garamond" w:hAnsi="Garamond"/>
           <w:color w:val="000000" w:themeColor="text1"/>
         </w:rPr>
-        <w:t>LEA Retreat, Vanderbilt University</w:t>
+        <w:t>Law and Entrepreneurship Association (LEA) Retreat, Vanderbilt University</w:t>
       </w:r>
     </w:p>
     <w:p>
@@ -3935,7 +3935,7 @@
           <w:rFonts w:ascii="Garamond" w:hAnsi="Garamond"/>
           <w:color w:val="000000" w:themeColor="text1"/>
         </w:rPr>
-        <w:t>LEA Retreat, University of Pennsylvania</w:t>
+        <w:t>Law and Entrepreneurship Association (LEA) Retreat, University of Pennsylvania</w:t>
       </w:r>
     </w:p>
     <w:p>

</xml_diff>